<commit_message>
Publicar la app en el release v1.0 y enlazar la descarga en la documentación
</commit_message>
<xml_diff>
--- a/entrega/Fase2_Documentacion_Software.docx
+++ b/entrega/Fase2_Documentacion_Software.docx
@@ -161,6 +161,19 @@
           <w:sz w:val="20"/>
         </w:rPr>
         <w:t>Repositorio: https://github.com/Nicolas0pm/guia9-visualizacion-datos</w:t>
+      </w:r>
+    </w:p>
+    <w:p>
+      <w:pPr>
+        <w:jc w:val="center"/>
+      </w:pPr>
+      <w:r>
+        <w:rPr>
+          <w:b w:val="0"/>
+          <w:i w:val="0"/>
+          <w:sz w:val="20"/>
+        </w:rPr>
+        <w:t>Descarga del software portable: https://github.com/Nicolas0pm/guia9-visualizacion-datos/releases/download/v1.0/VisualizadorEncuestas.zip</w:t>
       </w:r>
     </w:p>
     <w:p>
@@ -569,6 +582,40 @@
                 <w:sz w:val="20"/>
               </w:rPr>
               <w:t>https://github.com/Nicolas0pm/guia9-visualizacion-datos</w:t>
+            </w:r>
+          </w:p>
+        </w:tc>
+      </w:tr>
+      <w:tr>
+        <w:tc>
+          <w:tcPr>
+            <w:tcW w:type="dxa" w:w="2835"/>
+            <w:shd w:val="clear" w:color="auto" w:fill="EEF3F9"/>
+          </w:tcPr>
+          <w:p>
+            <w:r/>
+            <w:r>
+              <w:rPr>
+                <w:b w:val="0"/>
+                <w:sz w:val="20"/>
+              </w:rPr>
+              <w:t>Descarga (.zip)</w:t>
+            </w:r>
+          </w:p>
+        </w:tc>
+        <w:tc>
+          <w:tcPr>
+            <w:tcW w:type="dxa" w:w="6236"/>
+            <w:shd w:val="clear" w:color="auto" w:fill="EEF3F9"/>
+          </w:tcPr>
+          <w:p>
+            <w:r/>
+            <w:r>
+              <w:rPr>
+                <w:b w:val="0"/>
+                <w:sz w:val="20"/>
+              </w:rPr>
+              <w:t>https://github.com/Nicolas0pm/guia9-visualizacion-datos/releases/download/v1.0/VisualizadorEncuestas.zip</w:t>
             </w:r>
           </w:p>
         </w:tc>
@@ -3888,6 +3935,25 @@
     </w:p>
     <w:p>
       <w:pPr>
+        <w:jc w:val="both"/>
+      </w:pPr>
+      <w:r>
+        <w:rPr>
+          <w:b/>
+          <w:i w:val="0"/>
+        </w:rPr>
+        <w:t>Descarga del programa (versión 1.0):</w:t>
+      </w:r>
+      <w:r>
+        <w:rPr>
+          <w:b w:val="0"/>
+          <w:i w:val="0"/>
+        </w:rPr>
+        <w:t xml:space="preserve"> https://github.com/Nicolas0pm/guia9-visualizacion-datos/releases/download/v1.0/VisualizadorEncuestas.zip. Se descarga el .zip, se descomprime y se abre VisualizadorEncuestas.exe.</w:t>
+      </w:r>
+    </w:p>
+    <w:p>
+      <w:pPr>
         <w:pStyle w:val="Heading1"/>
       </w:pPr>
       <w:r>

</xml_diff>